<commit_message>
Add EMS passport icon and demo data
</commit_message>
<xml_diff>
--- a/docs/docx/configuration.docx
+++ b/docs/docx/configuration.docx
@@ -84,6 +84,52 @@
     <w:p>
       <w:r>
         <w:t>Configure Appointment Location, Appointment Service Type, Appointment Officer, and Appointment Slot. Slots can be used for internal booking or mapped to external booking references in Embassy Appointment.</w:t>
+      </w:r>
+    </w:p>
+    <w:p>
+      <w:pPr>
+        <w:pStyle w:val="Heading2"/>
+      </w:pPr>
+      <w:r>
+        <w:t>Presentation Data</w:t>
+      </w:r>
+    </w:p>
+    <w:p>
+      <w:r>
+        <w:t xml:space="preserve">Use </w:t>
+      </w:r>
+      <w:r>
+        <w:rPr>
+          <w:rFonts w:ascii="Consolas" w:hAnsi="Consolas"/>
+          <w:color w:val="144870"/>
+          <w:sz w:val="19"/>
+        </w:rPr>
+        <w:t>./scripts/load-sample-data.sh</w:t>
+      </w:r>
+      <w:r>
+        <w:t xml:space="preserve"> to load removable </w:t>
+      </w:r>
+      <w:r>
+        <w:rPr>
+          <w:rFonts w:ascii="Consolas" w:hAnsi="Consolas"/>
+          <w:color w:val="144870"/>
+          <w:sz w:val="19"/>
+        </w:rPr>
+        <w:t>EMSDEMO</w:t>
+      </w:r>
+      <w:r>
+        <w:t xml:space="preserve"> records across EMS and standard ERPNext masters for demonstrations. Use </w:t>
+      </w:r>
+      <w:r>
+        <w:rPr>
+          <w:rFonts w:ascii="Consolas" w:hAnsi="Consolas"/>
+          <w:color w:val="144870"/>
+          <w:sz w:val="19"/>
+        </w:rPr>
+        <w:t>./scripts/clear-sample-data.sh</w:t>
+      </w:r>
+      <w:r>
+        <w:t xml:space="preserve"> after the presentation to remove the tagged sample data without touching real mission records.</w:t>
       </w:r>
     </w:p>
     <w:sectPr>

</xml_diff>